<commit_message>
update docs for recursion on Wed, Aug 19, 2026  01:07:00 AM
</commit_message>
<xml_diff>
--- a/DSA/CppStriverDSA/StriverSDESheet-Recursion.docx
+++ b/DSA/CppStriverDSA/StriverSDESheet-Recursion.docx
@@ -1,6 +1,6 @@
 
 <file path=word/document.xml><?xml version="1.0" encoding="utf-8"?>
-<w:document xmlns:wpc="http://schemas.microsoft.com/office/word/2010/wordprocessingCanvas" xmlns:cx="http://schemas.microsoft.com/office/drawing/2014/chartex" xmlns:cx1="http://schemas.microsoft.com/office/drawing/2015/9/8/chartex" xmlns:cx2="http://schemas.microsoft.com/office/drawing/2015/10/21/chartex" xmlns:cx3="http://schemas.microsoft.com/office/drawing/2016/5/9/chartex" xmlns:cx4="http://schemas.microsoft.com/office/drawing/2016/5/10/chartex" xmlns:cx5="http://schemas.microsoft.com/office/drawing/2016/5/11/chartex" xmlns:cx6="http://schemas.microsoft.com/office/drawing/2016/5/12/chartex" xmlns:cx7="http://schemas.microsoft.com/office/drawing/2016/5/13/chartex" xmlns:cx8="http://schemas.microsoft.com/office/drawing/2016/5/14/chartex" xmlns:mc="http://schemas.openxmlformats.org/markup-compatibility/2006" xmlns:aink="http://schemas.microsoft.com/office/drawing/2016/ink" xmlns:am3d="http://schemas.microsoft.com/office/drawing/2017/model3d" xmlns:o="urn:schemas-microsoft-com:office:office" xmlns:oel="http://schemas.microsoft.com/office/2019/extlst" xmlns:r="http://schemas.openxmlformats.org/officeDocument/2006/relationships" xmlns:m="http://schemas.openxmlformats.org/officeDocument/2006/math" xmlns:v="urn:schemas-microsoft-com:vml" xmlns:wp14="http://schemas.microsoft.com/office/word/2010/wordprocessingDrawing" xmlns:wp="http://schemas.openxmlformats.org/drawingml/2006/wordprocessingDrawing" xmlns:w10="urn:schemas-microsoft-com:office:word" xmlns:w="http://schemas.openxmlformats.org/wordprocessingml/2006/main" xmlns:w14="http://schemas.microsoft.com/office/word/2010/wordml" xmlns:w15="http://schemas.microsoft.com/office/word/2012/wordml" xmlns:w16cex="http://schemas.microsoft.com/office/word/2018/wordml/cex" xmlns:w16cid="http://schemas.microsoft.com/office/word/2016/wordml/cid" xmlns:w16="http://schemas.microsoft.com/office/word/2018/wordml" xmlns:w16sdtdh="http://schemas.microsoft.com/office/word/2020/wordml/sdtdatahash" xmlns:w16se="http://schemas.microsoft.com/office/word/2015/wordml/symex" xmlns:wpg="http://schemas.microsoft.com/office/word/2010/wordprocessingGroup" xmlns:wpi="http://schemas.microsoft.com/office/word/2010/wordprocessingInk" xmlns:wne="http://schemas.microsoft.com/office/word/2006/wordml" xmlns:wps="http://schemas.microsoft.com/office/word/2010/wordprocessingShape" mc:Ignorable="w14 w15 w16se w16cid w16 w16cex w16sdtdh wp14">
+<w:document xmlns:wpc="http://schemas.microsoft.com/office/word/2010/wordprocessingCanvas" xmlns:cx="http://schemas.microsoft.com/office/drawing/2014/chartex" xmlns:cx1="http://schemas.microsoft.com/office/drawing/2015/9/8/chartex" xmlns:cx2="http://schemas.microsoft.com/office/drawing/2015/10/21/chartex" xmlns:cx3="http://schemas.microsoft.com/office/drawing/2016/5/9/chartex" xmlns:cx4="http://schemas.microsoft.com/office/drawing/2016/5/10/chartex" xmlns:cx5="http://schemas.microsoft.com/office/drawing/2016/5/11/chartex" xmlns:cx6="http://schemas.microsoft.com/office/drawing/2016/5/12/chartex" xmlns:cx7="http://schemas.microsoft.com/office/drawing/2016/5/13/chartex" xmlns:cx8="http://schemas.microsoft.com/office/drawing/2016/5/14/chartex" xmlns:mc="http://schemas.openxmlformats.org/markup-compatibility/2006" xmlns:aink="http://schemas.microsoft.com/office/drawing/2016/ink" xmlns:am3d="http://schemas.microsoft.com/office/drawing/2017/model3d" xmlns:o="urn:schemas-microsoft-com:office:office" xmlns:oel="http://schemas.microsoft.com/office/2019/extlst" xmlns:r="http://schemas.openxmlformats.org/officeDocument/2006/relationships" xmlns:m="http://schemas.openxmlformats.org/officeDocument/2006/math" xmlns:v="urn:schemas-microsoft-com:vml" xmlns:wp14="http://schemas.microsoft.com/office/word/2010/wordprocessingDrawing" xmlns:wp="http://schemas.openxmlformats.org/drawingml/2006/wordprocessingDrawing" xmlns:w10="urn:schemas-microsoft-com:office:word" xmlns:w="http://schemas.openxmlformats.org/wordprocessingml/2006/main" xmlns:w14="http://schemas.microsoft.com/office/word/2010/wordml" xmlns:w15="http://schemas.microsoft.com/office/word/2012/wordml" xmlns:w16cei="http://schemas.microsoft.com/office/word/2026/wordml/cei" xmlns:w16cex="http://schemas.microsoft.com/office/word/2018/wordml/cex" xmlns:w16cid="http://schemas.microsoft.com/office/word/2016/wordml/cid" xmlns:w16="http://schemas.microsoft.com/office/word/2018/wordml" xmlns:w16du="http://schemas.microsoft.com/office/word/2023/wordml/word16du" xmlns:w16sdtdh="http://schemas.microsoft.com/office/word/2020/wordml/sdtdatahash" xmlns:w16sdtfl="http://schemas.microsoft.com/office/word/2024/wordml/sdtformatlock" xmlns:w16se="http://schemas.microsoft.com/office/word/2015/wordml/symex" xmlns:wpg="http://schemas.microsoft.com/office/word/2010/wordprocessingGroup" xmlns:wpi="http://schemas.microsoft.com/office/word/2010/wordprocessingInk" xmlns:wne="http://schemas.microsoft.com/office/word/2006/wordml" xmlns:wps="http://schemas.microsoft.com/office/word/2010/wordprocessingShape" mc:Ignorable="w14 w15 w16se w16cid w16 w16cex w16sdtdh w16sdtfl w16du wp14">
   <w:body>
     <w:p>
       <w:pPr>
@@ -6507,13 +6507,43 @@
         <w:rPr>
           <w:lang w:val="en-US"/>
         </w:rPr>
-        <w:t xml:space="preserve">,hence it will be </w:t>
-      </w:r>
-      <w:r>
-        <w:rPr>
-          <w:lang w:val="en-US"/>
-        </w:rPr>
-        <w:t xml:space="preserve">2^n </w:t>
+        <w:t xml:space="preserve"> </w:t>
+      </w:r>
+      <w:r>
+        <w:rPr>
+          <w:lang w:val="en-US"/>
+        </w:rPr>
+        <w:t>,</w:t>
+      </w:r>
+      <w:r>
+        <w:rPr>
+          <w:lang w:val="en-US"/>
+        </w:rPr>
+        <w:t xml:space="preserve"> </w:t>
+      </w:r>
+      <w:r>
+        <w:rPr>
+          <w:lang w:val="en-US"/>
+        </w:rPr>
+        <w:t xml:space="preserve">hence it will be </w:t>
+      </w:r>
+      <w:r>
+        <w:rPr>
+          <w:lang w:val="en-US"/>
+        </w:rPr>
+        <w:t>2^n</w:t>
+      </w:r>
+      <w:r>
+        <w:rPr>
+          <w:lang w:val="en-US"/>
+        </w:rPr>
+        <w:t>.</w:t>
+      </w:r>
+      <w:r>
+        <w:rPr>
+          <w:lang w:val="en-US"/>
+        </w:rPr>
+        <w:t xml:space="preserve"> </w:t>
       </w:r>
     </w:p>
     <w:p>
@@ -6534,7 +6564,7 @@
           <w:noProof/>
         </w:rPr>
         <w:drawing>
-          <wp:inline distT="0" distB="0" distL="0" distR="0">
+          <wp:inline distT="0" distB="0" distL="0" distR="0" wp14:anchorId="389BF74E" wp14:editId="526B30B8">
             <wp:extent cx="5731510" cy="3439160"/>
             <wp:effectExtent l="0" t="0" r="2540" b="8890"/>
             <wp:docPr id="1" name="Picture 1" descr="Fibonacci Sequence Algorithm: Recursion and Dynamic Programming"/>
@@ -6551,7 +6581,7 @@
                     </pic:cNvPicPr>
                   </pic:nvPicPr>
                   <pic:blipFill>
-                    <a:blip r:embed="rId5">
+                    <a:blip r:embed="rId6">
                       <a:extLst>
                         <a:ext uri="{28A0092B-C50C-407E-A947-70E740481C1C}">
                           <a14:useLocalDpi xmlns:a14="http://schemas.microsoft.com/office/drawing/2010/main" val="0"/>
@@ -7223,7 +7253,7 @@
                     <pic:cNvPicPr/>
                   </pic:nvPicPr>
                   <pic:blipFill>
-                    <a:blip r:embed="rId6"/>
+                    <a:blip r:embed="rId7"/>
                     <a:stretch>
                       <a:fillRect/>
                     </a:stretch>
@@ -8725,7 +8755,7 @@
           <w:lang w:val="en-US"/>
         </w:rPr>
         <w:drawing>
-          <wp:anchor distT="0" distB="0" distL="114300" distR="114300" simplePos="0" relativeHeight="251658240" behindDoc="0" locked="0" layoutInCell="1" allowOverlap="1" wp14:anchorId="79ECD156">
+          <wp:anchor distT="0" distB="0" distL="114300" distR="114300" simplePos="0" relativeHeight="251658240" behindDoc="0" locked="0" layoutInCell="1" allowOverlap="1" wp14:anchorId="79ECD156" wp14:editId="7538E453">
             <wp:simplePos x="0" y="0"/>
             <wp:positionH relativeFrom="margin">
               <wp:posOffset>-457200</wp:posOffset>
@@ -8748,7 +8778,7 @@
                     <pic:cNvPicPr/>
                   </pic:nvPicPr>
                   <pic:blipFill>
-                    <a:blip r:embed="rId7">
+                    <a:blip r:embed="rId8">
                       <a:extLst>
                         <a:ext uri="{28A0092B-C50C-407E-A947-70E740481C1C}">
                           <a14:useLocalDpi xmlns:a14="http://schemas.microsoft.com/office/drawing/2010/main" val="0"/>
@@ -9317,10 +9347,7 @@
         <w:t>Intution :</w:t>
       </w:r>
       <w:r>
-        <w:t xml:space="preserve"> </w:t>
-      </w:r>
-      <w:r>
-        <w:t>We start by considering all possible partition lengths, starting from the first character of the string. For each partition length, we check if the substring from the start index to the current index is a palindrome. If it is, we add it to the current path and recursively explore all possible partitions starting from the next index.</w:t>
+        <w:t xml:space="preserve"> We start by considering all possible partition lengths, starting from the first character of the string. For each partition length, we check if the substring from the start index to the current index is a palindrome. If it is, we add it to the current path and recursively explore all possible partitions starting from the next index.</w:t>
       </w:r>
     </w:p>
     <w:p/>
@@ -9493,7 +9520,7 @@
 </file>
 
 <file path=word/numbering.xml><?xml version="1.0" encoding="utf-8"?>
-<w:numbering xmlns:wpc="http://schemas.microsoft.com/office/word/2010/wordprocessingCanvas" xmlns:cx="http://schemas.microsoft.com/office/drawing/2014/chartex" xmlns:cx1="http://schemas.microsoft.com/office/drawing/2015/9/8/chartex" xmlns:cx2="http://schemas.microsoft.com/office/drawing/2015/10/21/chartex" xmlns:cx3="http://schemas.microsoft.com/office/drawing/2016/5/9/chartex" xmlns:cx4="http://schemas.microsoft.com/office/drawing/2016/5/10/chartex" xmlns:cx5="http://schemas.microsoft.com/office/drawing/2016/5/11/chartex" xmlns:cx6="http://schemas.microsoft.com/office/drawing/2016/5/12/chartex" xmlns:cx7="http://schemas.microsoft.com/office/drawing/2016/5/13/chartex" xmlns:cx8="http://schemas.microsoft.com/office/drawing/2016/5/14/chartex" xmlns:mc="http://schemas.openxmlformats.org/markup-compatibility/2006" xmlns:aink="http://schemas.microsoft.com/office/drawing/2016/ink" xmlns:am3d="http://schemas.microsoft.com/office/drawing/2017/model3d" xmlns:o="urn:schemas-microsoft-com:office:office" xmlns:oel="http://schemas.microsoft.com/office/2019/extlst" xmlns:r="http://schemas.openxmlformats.org/officeDocument/2006/relationships" xmlns:m="http://schemas.openxmlformats.org/officeDocument/2006/math" xmlns:v="urn:schemas-microsoft-com:vml" xmlns:wp14="http://schemas.microsoft.com/office/word/2010/wordprocessingDrawing" xmlns:wp="http://schemas.openxmlformats.org/drawingml/2006/wordprocessingDrawing" xmlns:w10="urn:schemas-microsoft-com:office:word" xmlns:w="http://schemas.openxmlformats.org/wordprocessingml/2006/main" xmlns:w14="http://schemas.microsoft.com/office/word/2010/wordml" xmlns:w15="http://schemas.microsoft.com/office/word/2012/wordml" xmlns:w16cex="http://schemas.microsoft.com/office/word/2018/wordml/cex" xmlns:w16cid="http://schemas.microsoft.com/office/word/2016/wordml/cid" xmlns:w16="http://schemas.microsoft.com/office/word/2018/wordml" xmlns:w16sdtdh="http://schemas.microsoft.com/office/word/2020/wordml/sdtdatahash" xmlns:w16se="http://schemas.microsoft.com/office/word/2015/wordml/symex" xmlns:wpg="http://schemas.microsoft.com/office/word/2010/wordprocessingGroup" xmlns:wpi="http://schemas.microsoft.com/office/word/2010/wordprocessingInk" xmlns:wne="http://schemas.microsoft.com/office/word/2006/wordml" xmlns:wps="http://schemas.microsoft.com/office/word/2010/wordprocessingShape" mc:Ignorable="w14 w15 w16se w16cid w16 w16cex w16sdtdh wp14">
+<w:numbering xmlns:wpc="http://schemas.microsoft.com/office/word/2010/wordprocessingCanvas" xmlns:cx="http://schemas.microsoft.com/office/drawing/2014/chartex" xmlns:cx1="http://schemas.microsoft.com/office/drawing/2015/9/8/chartex" xmlns:cx2="http://schemas.microsoft.com/office/drawing/2015/10/21/chartex" xmlns:cx3="http://schemas.microsoft.com/office/drawing/2016/5/9/chartex" xmlns:cx4="http://schemas.microsoft.com/office/drawing/2016/5/10/chartex" xmlns:cx5="http://schemas.microsoft.com/office/drawing/2016/5/11/chartex" xmlns:cx6="http://schemas.microsoft.com/office/drawing/2016/5/12/chartex" xmlns:cx7="http://schemas.microsoft.com/office/drawing/2016/5/13/chartex" xmlns:cx8="http://schemas.microsoft.com/office/drawing/2016/5/14/chartex" xmlns:mc="http://schemas.openxmlformats.org/markup-compatibility/2006" xmlns:aink="http://schemas.microsoft.com/office/drawing/2016/ink" xmlns:am3d="http://schemas.microsoft.com/office/drawing/2017/model3d" xmlns:o="urn:schemas-microsoft-com:office:office" xmlns:oel="http://schemas.microsoft.com/office/2019/extlst" xmlns:r="http://schemas.openxmlformats.org/officeDocument/2006/relationships" xmlns:m="http://schemas.openxmlformats.org/officeDocument/2006/math" xmlns:v="urn:schemas-microsoft-com:vml" xmlns:wp14="http://schemas.microsoft.com/office/word/2010/wordprocessingDrawing" xmlns:wp="http://schemas.openxmlformats.org/drawingml/2006/wordprocessingDrawing" xmlns:w10="urn:schemas-microsoft-com:office:word" xmlns:w="http://schemas.openxmlformats.org/wordprocessingml/2006/main" xmlns:w14="http://schemas.microsoft.com/office/word/2010/wordml" xmlns:w15="http://schemas.microsoft.com/office/word/2012/wordml" xmlns:w16cei="http://schemas.microsoft.com/office/word/2026/wordml/cei" xmlns:w16cex="http://schemas.microsoft.com/office/word/2018/wordml/cex" xmlns:w16cid="http://schemas.microsoft.com/office/word/2016/wordml/cid" xmlns:w16="http://schemas.microsoft.com/office/word/2018/wordml" xmlns:w16du="http://schemas.microsoft.com/office/word/2023/wordml/word16du" xmlns:w16sdtdh="http://schemas.microsoft.com/office/word/2020/wordml/sdtdatahash" xmlns:w16sdtfl="http://schemas.microsoft.com/office/word/2024/wordml/sdtformatlock" xmlns:w16se="http://schemas.microsoft.com/office/word/2015/wordml/symex" xmlns:wpg="http://schemas.microsoft.com/office/word/2010/wordprocessingGroup" xmlns:wpi="http://schemas.microsoft.com/office/word/2010/wordprocessingInk" xmlns:wne="http://schemas.microsoft.com/office/word/2006/wordml" xmlns:wps="http://schemas.microsoft.com/office/word/2010/wordprocessingShape" mc:Ignorable="w14 w15 w16se w16cid w16 w16cex w16sdtdh w16sdtfl w16du wp14">
   <w:abstractNum w:abstractNumId="0" w15:restartNumberingAfterBreak="0">
     <w:nsid w:val="26A24D37"/>
     <w:multiLevelType w:val="hybridMultilevel"/>
@@ -9831,7 +9858,7 @@
 </file>
 
 <file path=word/styles.xml><?xml version="1.0" encoding="utf-8"?>
-<w:styles xmlns:mc="http://schemas.openxmlformats.org/markup-compatibility/2006" xmlns:r="http://schemas.openxmlformats.org/officeDocument/2006/relationships" xmlns:w="http://schemas.openxmlformats.org/wordprocessingml/2006/main" xmlns:w14="http://schemas.microsoft.com/office/word/2010/wordml" xmlns:w15="http://schemas.microsoft.com/office/word/2012/wordml" xmlns:w16cex="http://schemas.microsoft.com/office/word/2018/wordml/cex" xmlns:w16cid="http://schemas.microsoft.com/office/word/2016/wordml/cid" xmlns:w16="http://schemas.microsoft.com/office/word/2018/wordml" xmlns:w16sdtdh="http://schemas.microsoft.com/office/word/2020/wordml/sdtdatahash" xmlns:w16se="http://schemas.microsoft.com/office/word/2015/wordml/symex" mc:Ignorable="w14 w15 w16se w16cid w16 w16cex w16sdtdh">
+<w:styles xmlns:mc="http://schemas.openxmlformats.org/markup-compatibility/2006" xmlns:r="http://schemas.openxmlformats.org/officeDocument/2006/relationships" xmlns:w="http://schemas.openxmlformats.org/wordprocessingml/2006/main" xmlns:w14="http://schemas.microsoft.com/office/word/2010/wordml" xmlns:w15="http://schemas.microsoft.com/office/word/2012/wordml" xmlns:w16cex="http://schemas.microsoft.com/office/word/2018/wordml/cex" xmlns:w16cid="http://schemas.microsoft.com/office/word/2016/wordml/cid" xmlns:w16="http://schemas.microsoft.com/office/word/2018/wordml" xmlns:w16du="http://schemas.microsoft.com/office/word/2023/wordml/word16du" xmlns:w16sdtdh="http://schemas.microsoft.com/office/word/2020/wordml/sdtdatahash" xmlns:w16sdtfl="http://schemas.microsoft.com/office/word/2024/wordml/sdtformatlock" xmlns:w16se="http://schemas.microsoft.com/office/word/2015/wordml/symex" mc:Ignorable="w14 w15 w16se w16cid w16 w16cex w16sdtdh w16sdtfl w16du">
   <w:docDefaults>
     <w:rPrDefault>
       <w:rPr>
@@ -10789,4 +10816,16 @@
     </a:ext>
   </a:extLst>
 </a:theme>
+</file>
+
+<file path=customXml/item1.xml><?xml version="1.0" encoding="utf-8"?>
+<b:Sources xmlns:b="http://schemas.openxmlformats.org/officeDocument/2006/bibliography" xmlns="http://schemas.openxmlformats.org/officeDocument/2006/bibliography" SelectedStyle="\APASixthEditionOfficeOnline.xsl" StyleName="APA" Version="6"/>
+</file>
+
+<file path=customXml/itemProps1.xml><?xml version="1.0" encoding="utf-8"?>
+<ds:datastoreItem xmlns:ds="http://schemas.openxmlformats.org/officeDocument/2006/customXml" ds:itemID="{94FDF11D-5EB9-4E73-97CC-1C3AEBA4FD87}">
+  <ds:schemaRefs>
+    <ds:schemaRef ds:uri="http://schemas.openxmlformats.org/officeDocument/2006/bibliography"/>
+  </ds:schemaRefs>
+</ds:datastoreItem>
 </file>
</xml_diff>